<commit_message>
test(harness): regenerate T1/T8 bundle screenshots + after.docx (build .12, consistent before/after)
The re-capture only refreshed the JSON; the before.png/after.png/after.docx were
still from 2026-06-29 (old pre-A-rules behavior), which read as bugs on screen —
notably T8's old before.png showed the WRONG cell selected (Alpha, not the C(1,1)
Delta cell), making the correct Delta-cell injection look like a cross-cell jump.

Regenerated all evidence in one pass on build .12 (per feedback_recapture_one_pass):
- before.png shows the selection (départ); after.png shows the result (arrivée)
- after.docx = forcesave, save-fidelity verified to match the live model
- meta annotated with the 0-indexed cell mapping (C(0,0)=Alpha … C(1,1)=Delta)

Content: T1/insert Alpha¶XXX; T1/replace XXX; T8/insert Delta¶AAA¶BBB¶Delta2;
T8/replace CCC¶DDD¶Delta2. Outro/Intro intact throughout.
</commit_message>
<xml_diff>
--- a/test-harness/corpus/T1/insert/after.docx
+++ b/test-harness/corpus/T1/insert/after.docx
@@ -40,6 +40,7 @@
           </w:tcPr>
           <w:p>
             <w:pPr>
+              <w:pStyle w:val="138"/>
               <w:pBdr/>
               <w:spacing/>
               <w:ind/>
@@ -50,6 +51,15 @@
             </w:r>
             <w:r/>
             <w:r/>
+            <w:r/>
+          </w:p>
+          <w:p>
+            <w:pPr>
+              <w:pBdr/>
+              <w:spacing/>
+              <w:ind/>
+              <w:rPr/>
+            </w:pPr>
             <w:r>
               <w:rPr>
                 <w:rFonts w:hint="default" w:ascii="Times New Roman" w:hAnsi="Times New Roman" w:eastAsia="Times New Roman" w:cs="Times New Roman"/>
@@ -57,7 +67,6 @@
               </w:rPr>
               <w:t xml:space="preserve">XXX</w:t>
             </w:r>
-            <w:r/>
             <w:r/>
           </w:p>
         </w:tc>

</xml_diff>